<commit_message>
docs: update README, add backend README and decisions
</commit_message>
<xml_diff>
--- a/docs/Lost-and-Found-Ke-hoach-30-ngay.docx
+++ b/docs/Lost-and-Found-Ke-hoach-30-ngay.docx
@@ -3941,15 +3941,15 @@
           <w:sz w:val="22"/>
           <w:szCs w:val="22"/>
         </w:rPr>
-        <w:t xml:space="preserve">Authentication</w:t>
-      </w:r>
-      <w:r>
-        <w:rPr>
-          <w:rFonts w:ascii="Calibri" w:cs="Calibri" w:eastAsia="Calibri" w:hAnsi="Calibri"/>
-          <w:sz w:val="22"/>
-          <w:szCs w:val="22"/>
-        </w:rPr>
-        <w:t xml:space="preserve">, phần cấu hình đăng nhập bằng Email: tắt </w:t>
+        <w:t xml:space="preserve">Authentication → Configuration → Sign In / Providers</w:t>
+      </w:r>
+      <w:r>
+        <w:rPr>
+          <w:rFonts w:ascii="Calibri" w:cs="Calibri" w:eastAsia="Calibri" w:hAnsi="Calibri"/>
+          <w:sz w:val="22"/>
+          <w:szCs w:val="22"/>
+        </w:rPr>
+        <w:t xml:space="preserve">. Tắt </w:t>
       </w:r>
       <w:r>
         <w:rPr>
@@ -3959,15 +3959,15 @@
           <w:sz w:val="22"/>
           <w:szCs w:val="22"/>
         </w:rPr>
-        <w:t xml:space="preserve">Confirm email</w:t>
-      </w:r>
-      <w:r>
-        <w:rPr>
-          <w:rFonts w:ascii="Calibri" w:cs="Calibri" w:eastAsia="Calibri" w:hAnsi="Calibri"/>
-          <w:sz w:val="22"/>
-          <w:szCs w:val="22"/>
-        </w:rPr>
-        <w:t xml:space="preserve">. Tắt tùy chọn cho phép người lạ </w:t>
+        <w:t xml:space="preserve">Allow new users to sign up</w:t>
+      </w:r>
+      <w:r>
+        <w:rPr>
+          <w:rFonts w:ascii="Calibri" w:cs="Calibri" w:eastAsia="Calibri" w:hAnsi="Calibri"/>
+          <w:sz w:val="22"/>
+          <w:szCs w:val="22"/>
+        </w:rPr>
+        <w:t xml:space="preserve">. Bấm vào nhà cung cấp </w:t>
       </w:r>
       <w:r>
         <w:rPr>
@@ -3977,15 +3977,33 @@
           <w:sz w:val="22"/>
           <w:szCs w:val="22"/>
         </w:rPr>
-        <w:t xml:space="preserve">tự đăng ký</w:t>
-      </w:r>
-      <w:r>
-        <w:rPr>
-          <w:rFonts w:ascii="Calibri" w:cs="Calibri" w:eastAsia="Calibri" w:hAnsi="Calibri"/>
-          <w:sz w:val="22"/>
-          <w:szCs w:val="22"/>
-        </w:rPr>
-        <w:t xml:space="preserve"> (Allow new users to sign up). Tên menu có thể khác đôi chút tùy phiên bản giao diện.</w:t>
+        <w:t xml:space="preserve">Email</w:t>
+      </w:r>
+      <w:r>
+        <w:rPr>
+          <w:rFonts w:ascii="Calibri" w:cs="Calibri" w:eastAsia="Calibri" w:hAnsi="Calibri"/>
+          <w:sz w:val="22"/>
+          <w:szCs w:val="22"/>
+        </w:rPr>
+        <w:t xml:space="preserve"> và tắt </w:t>
+      </w:r>
+      <w:r>
+        <w:rPr>
+          <w:rFonts w:ascii="Calibri" w:cs="Calibri" w:eastAsia="Calibri" w:hAnsi="Calibri"/>
+          <w:b/>
+          <w:bCs/>
+          <w:sz w:val="22"/>
+          <w:szCs w:val="22"/>
+        </w:rPr>
+        <w:t xml:space="preserve">Confirm email</w:t>
+      </w:r>
+      <w:r>
+        <w:rPr>
+          <w:rFonts w:ascii="Calibri" w:cs="Calibri" w:eastAsia="Calibri" w:hAnsi="Calibri"/>
+          <w:sz w:val="22"/>
+          <w:szCs w:val="22"/>
+        </w:rPr>
+        <w:t xml:space="preserve">, rồi Save. (Lưu ý: trang *Email Templates* chỉ là mẫu nội dung email, không phải nơi cài đặt này.) Tên menu có thể khác đôi chút tùy phiên bản giao diện.</w:t>
       </w:r>
     </w:p>
     <w:p>
@@ -4003,7 +4021,7 @@
           <w:sz w:val="22"/>
           <w:szCs w:val="22"/>
         </w:rPr>
-        <w:t xml:space="preserve">Vào </w:t>
+        <w:t xml:space="preserve">Lấy </w:t>
       </w:r>
       <w:r>
         <w:rPr>
@@ -4013,15 +4031,83 @@
           <w:sz w:val="22"/>
           <w:szCs w:val="22"/>
         </w:rPr>
-        <w:t xml:space="preserve">Project Settings → API Keys</w:t>
-      </w:r>
-      <w:r>
-        <w:rPr>
-          <w:rFonts w:ascii="Calibri" w:cs="Calibri" w:eastAsia="Calibri" w:hAnsi="Calibri"/>
-          <w:sz w:val="22"/>
-          <w:szCs w:val="22"/>
-        </w:rPr>
-        <w:t xml:space="preserve">. Ghi lại: Project URL, </w:t>
+        <w:t xml:space="preserve">Project URL</w:t>
+      </w:r>
+      <w:r>
+        <w:rPr>
+          <w:rFonts w:ascii="Calibri" w:cs="Calibri" w:eastAsia="Calibri" w:hAnsi="Calibri"/>
+          <w:sz w:val="22"/>
+          <w:szCs w:val="22"/>
+        </w:rPr>
+        <w:t xml:space="preserve"> ở </w:t>
+      </w:r>
+      <w:r>
+        <w:rPr>
+          <w:rFonts w:ascii="Calibri" w:cs="Calibri" w:eastAsia="Calibri" w:hAnsi="Calibri"/>
+          <w:b/>
+          <w:bCs/>
+          <w:sz w:val="22"/>
+          <w:szCs w:val="22"/>
+        </w:rPr>
+        <w:t xml:space="preserve">Project Settings → Integrations → Data API</w:t>
+      </w:r>
+      <w:r>
+        <w:rPr>
+          <w:rFonts w:ascii="Calibri" w:cs="Calibri" w:eastAsia="Calibri" w:hAnsi="Calibri"/>
+          <w:sz w:val="22"/>
+          <w:szCs w:val="22"/>
+        </w:rPr>
+        <w:t xml:space="preserve"> (dạng </w:t>
+      </w:r>
+      <w:r>
+        <w:rPr>
+          <w:rFonts w:ascii="Consolas" w:cs="Consolas" w:eastAsia="Consolas" w:hAnsi="Consolas"/>
+          <w:sz w:val="20"/>
+          <w:szCs w:val="20"/>
+        </w:rPr>
+        <w:t xml:space="preserve">https://&lt;mã&gt;.supabase.co</w:t>
+      </w:r>
+      <w:r>
+        <w:rPr>
+          <w:rFonts w:ascii="Calibri" w:cs="Calibri" w:eastAsia="Calibri" w:hAnsi="Calibri"/>
+          <w:sz w:val="22"/>
+          <w:szCs w:val="22"/>
+        </w:rPr>
+        <w:t xml:space="preserve">, không có </w:t>
+      </w:r>
+      <w:r>
+        <w:rPr>
+          <w:rFonts w:ascii="Consolas" w:cs="Consolas" w:eastAsia="Consolas" w:hAnsi="Consolas"/>
+          <w:sz w:val="20"/>
+          <w:szCs w:val="20"/>
+        </w:rPr>
+        <w:t xml:space="preserve">/rest/v1/</w:t>
+      </w:r>
+      <w:r>
+        <w:rPr>
+          <w:rFonts w:ascii="Calibri" w:cs="Calibri" w:eastAsia="Calibri" w:hAnsi="Calibri"/>
+          <w:sz w:val="22"/>
+          <w:szCs w:val="22"/>
+        </w:rPr>
+        <w:t xml:space="preserve">). Lấy các khóa ở </w:t>
+      </w:r>
+      <w:r>
+        <w:rPr>
+          <w:rFonts w:ascii="Calibri" w:cs="Calibri" w:eastAsia="Calibri" w:hAnsi="Calibri"/>
+          <w:b/>
+          <w:bCs/>
+          <w:sz w:val="22"/>
+          <w:szCs w:val="22"/>
+        </w:rPr>
+        <w:t xml:space="preserve">Project Settings → Configuration → API Keys</w:t>
+      </w:r>
+      <w:r>
+        <w:rPr>
+          <w:rFonts w:ascii="Calibri" w:cs="Calibri" w:eastAsia="Calibri" w:hAnsi="Calibri"/>
+          <w:sz w:val="22"/>
+          <w:szCs w:val="22"/>
+        </w:rPr>
+        <w:t xml:space="preserve">: </w:t>
       </w:r>
       <w:r>
         <w:rPr>
@@ -4075,7 +4161,7 @@
           <w:sz w:val="22"/>
           <w:szCs w:val="22"/>
         </w:rPr>
-        <w:t xml:space="preserve">Vào </w:t>
+        <w:t xml:space="preserve">Bấm nút </w:t>
       </w:r>
       <w:r>
         <w:rPr>
@@ -4085,15 +4171,33 @@
           <w:sz w:val="22"/>
           <w:szCs w:val="22"/>
         </w:rPr>
-        <w:t xml:space="preserve">Database → Connection string</w:t>
-      </w:r>
-      <w:r>
-        <w:rPr>
-          <w:rFonts w:ascii="Calibri" w:cs="Calibri" w:eastAsia="Calibri" w:hAnsi="Calibri"/>
-          <w:sz w:val="22"/>
-          <w:szCs w:val="22"/>
-        </w:rPr>
-        <w:t xml:space="preserve">, lấy chuỗi kết nối kiểu pooler cho backend.</w:t>
+        <w:t xml:space="preserve">Connect</w:t>
+      </w:r>
+      <w:r>
+        <w:rPr>
+          <w:rFonts w:ascii="Calibri" w:cs="Calibri" w:eastAsia="Calibri" w:hAnsi="Calibri"/>
+          <w:sz w:val="22"/>
+          <w:szCs w:val="22"/>
+        </w:rPr>
+        <w:t xml:space="preserve"> ở đầu trang, chọn </w:t>
+      </w:r>
+      <w:r>
+        <w:rPr>
+          <w:rFonts w:ascii="Calibri" w:cs="Calibri" w:eastAsia="Calibri" w:hAnsi="Calibri"/>
+          <w:b/>
+          <w:bCs/>
+          <w:sz w:val="22"/>
+          <w:szCs w:val="22"/>
+        </w:rPr>
+        <w:t xml:space="preserve">Session pooler</w:t>
+      </w:r>
+      <w:r>
+        <w:rPr>
+          <w:rFonts w:ascii="Calibri" w:cs="Calibri" w:eastAsia="Calibri" w:hAnsi="Calibri"/>
+          <w:sz w:val="22"/>
+          <w:szCs w:val="22"/>
+        </w:rPr>
+        <w:t xml:space="preserve"> và lấy chuỗi kết nối cho backend (dùng cho từ ngày 5).</w:t>
       </w:r>
     </w:p>
     <w:p>
@@ -5073,7 +5177,7 @@
           <w:sz w:val="18"/>
           <w:szCs w:val="18"/>
         </w:rPr>
-        <w:t xml:space="preserve">pip install fastapi "uvicorn[standard]" pydantic-settings sqlalchemy asyncpg "pyjwt[crypto]" httpx slowapi python-dotenv</w:t>
+        <w:t xml:space="preserve">pip install fastapi "uvicorn[standard]" pydantic-settings "pyjwt[crypto]" httpx "pydantic[email]" "psycopg[binary,pool]" slowapi</w:t>
       </w:r>
     </w:p>
     <w:p>
@@ -5608,7 +5712,41 @@
           <w:sz w:val="22"/>
           <w:szCs w:val="22"/>
         </w:rPr>
-        <w:t xml:space="preserve">Kết nối database bằng chuỗi pooler. Nếu gặp lỗi liên quan prepared statement khi dùng chế độ transaction pooler, chuyển sang session pooler hoặc tắt statement cache của asyncpg.</w:t>
+        <w:t xml:space="preserve">Kết nối database bằng chuỗi </w:t>
+      </w:r>
+      <w:r>
+        <w:rPr>
+          <w:rFonts w:ascii="Calibri" w:cs="Calibri" w:eastAsia="Calibri" w:hAnsi="Calibri"/>
+          <w:b/>
+          <w:bCs/>
+          <w:sz w:val="22"/>
+          <w:szCs w:val="22"/>
+        </w:rPr>
+        <w:t xml:space="preserve">Session pooler</w:t>
+      </w:r>
+      <w:r>
+        <w:rPr>
+          <w:rFonts w:ascii="Calibri" w:cs="Calibri" w:eastAsia="Calibri" w:hAnsi="Calibri"/>
+          <w:sz w:val="22"/>
+          <w:szCs w:val="22"/>
+        </w:rPr>
+        <w:t xml:space="preserve"> với thư viện </w:t>
+      </w:r>
+      <w:r>
+        <w:rPr>
+          <w:rFonts w:ascii="Consolas" w:cs="Consolas" w:eastAsia="Consolas" w:hAnsi="Consolas"/>
+          <w:sz w:val="20"/>
+          <w:szCs w:val="20"/>
+        </w:rPr>
+        <w:t xml:space="preserve">psycopg</w:t>
+      </w:r>
+      <w:r>
+        <w:rPr>
+          <w:rFonts w:ascii="Calibri" w:cs="Calibri" w:eastAsia="Calibri" w:hAnsi="Calibri"/>
+          <w:sz w:val="22"/>
+          <w:szCs w:val="22"/>
+        </w:rPr>
+        <w:t xml:space="preserve"> và SQL viết trực tiếp (làm từ ngày 5). Mật khẩu database có ký tự đặc biệt (@ : / ? #) phải được mã hóa URL, nếu không chuỗi kết nối sẽ sai.</w:t>
       </w:r>
     </w:p>
     <w:p>
@@ -5936,6 +6074,115 @@
           <w:szCs w:val="26"/>
         </w:rPr>
         <w:t xml:space="preserve">Tuần 1 (ngày 1–7, 22/10 – 28/10): nền móng, đăng nhập, khung giao diện</w:t>
+      </w:r>
+    </w:p>
+    <w:p>
+      <w:pPr>
+        <w:pBdr>
+          <w:left w:val="single" w:color="C26A1B" w:sz="24" w:space="8"/>
+        </w:pBdr>
+        <w:shd w:fill="FFF8E1" w:val="clear"/>
+        <w:spacing w:after="160" w:before="120" w:line="264"/>
+        <w:ind w:left="160" w:right="160"/>
+      </w:pPr>
+      <w:r>
+        <w:rPr>
+          <w:rFonts w:ascii="Calibri" w:cs="Calibri" w:eastAsia="Calibri" w:hAnsi="Calibri"/>
+          <w:b/>
+          <w:bCs/>
+          <w:color w:val="C26A1B"/>
+          <w:sz w:val="22"/>
+          <w:szCs w:val="22"/>
+        </w:rPr>
+        <w:t xml:space="preserve">Tiến độ thực tế của A (cập nhật 23/10): </w:t>
+      </w:r>
+      <w:r>
+        <w:rPr>
+          <w:rFonts w:ascii="Calibri" w:cs="Calibri" w:eastAsia="Calibri" w:hAnsi="Calibri"/>
+          <w:sz w:val="22"/>
+          <w:szCs w:val="22"/>
+        </w:rPr>
+        <w:t xml:space="preserve">Đã xong: dựng Supabase và chạy schema · khung FastAPI · kiểm tra token JWT và </w:t>
+      </w:r>
+      <w:r>
+        <w:rPr>
+          <w:rFonts w:ascii="Consolas" w:cs="Consolas" w:eastAsia="Consolas" w:hAnsi="Consolas"/>
+          <w:sz w:val="20"/>
+          <w:szCs w:val="20"/>
+        </w:rPr>
+        <w:t xml:space="preserve">/me</w:t>
+      </w:r>
+      <w:r>
+        <w:rPr>
+          <w:rFonts w:ascii="Calibri" w:cs="Calibri" w:eastAsia="Calibri" w:hAnsi="Calibri"/>
+          <w:sz w:val="22"/>
+          <w:szCs w:val="22"/>
+        </w:rPr>
+        <w:t xml:space="preserve"> · </w:t>
+      </w:r>
+      <w:r>
+        <w:rPr>
+          <w:rFonts w:ascii="Consolas" w:cs="Consolas" w:eastAsia="Consolas" w:hAnsi="Consolas"/>
+          <w:sz w:val="20"/>
+          <w:szCs w:val="20"/>
+        </w:rPr>
+        <w:t xml:space="preserve">POST /auth/register</w:t>
+      </w:r>
+      <w:r>
+        <w:rPr>
+          <w:rFonts w:ascii="Calibri" w:cs="Calibri" w:eastAsia="Calibri" w:hAnsi="Calibri"/>
+          <w:sz w:val="22"/>
+          <w:szCs w:val="22"/>
+        </w:rPr>
+        <w:t xml:space="preserve"> · triển khai lên Render (có địa chỉ công khai) · </w:t>
+      </w:r>
+      <w:r>
+        <w:rPr>
+          <w:rFonts w:ascii="Consolas" w:cs="Consolas" w:eastAsia="Consolas" w:hAnsi="Consolas"/>
+          <w:sz w:val="20"/>
+          <w:szCs w:val="20"/>
+        </w:rPr>
+        <w:t xml:space="preserve">docs/api.md</w:t>
+      </w:r>
+      <w:r>
+        <w:rPr>
+          <w:rFonts w:ascii="Calibri" w:cs="Calibri" w:eastAsia="Calibri" w:hAnsi="Calibri"/>
+          <w:sz w:val="22"/>
+          <w:szCs w:val="22"/>
+        </w:rPr>
+        <w:t xml:space="preserve">. Tiếp theo: </w:t>
+      </w:r>
+      <w:r>
+        <w:rPr>
+          <w:rFonts w:ascii="Consolas" w:cs="Consolas" w:eastAsia="Consolas" w:hAnsi="Consolas"/>
+          <w:sz w:val="20"/>
+          <w:szCs w:val="20"/>
+        </w:rPr>
+        <w:t xml:space="preserve">PUT /me/phone</w:t>
+      </w:r>
+      <w:r>
+        <w:rPr>
+          <w:rFonts w:ascii="Calibri" w:cs="Calibri" w:eastAsia="Calibri" w:hAnsi="Calibri"/>
+          <w:sz w:val="22"/>
+          <w:szCs w:val="22"/>
+        </w:rPr>
+        <w:t xml:space="preserve"> và </w:t>
+      </w:r>
+      <w:r>
+        <w:rPr>
+          <w:rFonts w:ascii="Consolas" w:cs="Consolas" w:eastAsia="Consolas" w:hAnsi="Consolas"/>
+          <w:sz w:val="20"/>
+          <w:szCs w:val="20"/>
+        </w:rPr>
+        <w:t xml:space="preserve">POST /posts</w:t>
+      </w:r>
+      <w:r>
+        <w:rPr>
+          <w:rFonts w:ascii="Calibri" w:cs="Calibri" w:eastAsia="Calibri" w:hAnsi="Calibri"/>
+          <w:sz w:val="22"/>
+          <w:szCs w:val="22"/>
+        </w:rPr>
+        <w:t xml:space="preserve"> (cần kết nối database trực tiếp).</w:t>
       </w:r>
     </w:p>
     <w:p>
@@ -12432,7 +12679,25 @@
           <w:sz w:val="22"/>
           <w:szCs w:val="22"/>
         </w:rPr>
-        <w:t xml:space="preserve"> với handle công khai: lấy phần trước @ của email, bỏ ký tự lạ, thêm 3 chữ số ngẫu nhiên, cắt cho vừa 20 ký tự. Nếu trùng thì sinh lại.</w:t>
+        <w:t xml:space="preserve"> với handle công khai: lấy phần trước @ của email, bỏ ký tự lạ, cắt cho vừa 15 ký tự. Thử tên gọn nhất trước; nếu trùng thì thêm 4 chữ số ngẫu nhiên và thử lại (tối đa 5 lần). Nếu cả bước này lỗi thì </w:t>
+      </w:r>
+      <w:r>
+        <w:rPr>
+          <w:rFonts w:ascii="Calibri" w:cs="Calibri" w:eastAsia="Calibri" w:hAnsi="Calibri"/>
+          <w:b/>
+          <w:bCs/>
+          <w:sz w:val="22"/>
+          <w:szCs w:val="22"/>
+        </w:rPr>
+        <w:t xml:space="preserve">xóa người dùng vừa tạo</w:t>
+      </w:r>
+      <w:r>
+        <w:rPr>
+          <w:rFonts w:ascii="Calibri" w:cs="Calibri" w:eastAsia="Calibri" w:hAnsi="Calibri"/>
+          <w:sz w:val="22"/>
+          <w:szCs w:val="22"/>
+        </w:rPr>
+        <w:t xml:space="preserve"> để không để lại tài khoản mồ côi.</w:t>
       </w:r>
     </w:p>
     <w:p>
@@ -14591,7 +14856,61 @@
           <w:sz w:val="22"/>
           <w:szCs w:val="22"/>
         </w:rPr>
-        <w:t xml:space="preserve"> đẩy code lên GitHub, tạo Web Service trên Render từ repo. Lệnh build </w:t>
+        <w:t xml:space="preserve"> tạo Web Service trên Render từ repo GitHub. Các ô quan trọng: </w:t>
+      </w:r>
+      <w:r>
+        <w:rPr>
+          <w:rFonts w:ascii="Calibri" w:cs="Calibri" w:eastAsia="Calibri" w:hAnsi="Calibri"/>
+          <w:b/>
+          <w:bCs/>
+          <w:sz w:val="22"/>
+          <w:szCs w:val="22"/>
+        </w:rPr>
+        <w:t xml:space="preserve">Language = Python 3</w:t>
+      </w:r>
+      <w:r>
+        <w:rPr>
+          <w:rFonts w:ascii="Calibri" w:cs="Calibri" w:eastAsia="Calibri" w:hAnsi="Calibri"/>
+          <w:sz w:val="22"/>
+          <w:szCs w:val="22"/>
+        </w:rPr>
+        <w:t xml:space="preserve"> (không chọn Docker), </w:t>
+      </w:r>
+      <w:r>
+        <w:rPr>
+          <w:rFonts w:ascii="Calibri" w:cs="Calibri" w:eastAsia="Calibri" w:hAnsi="Calibri"/>
+          <w:b/>
+          <w:bCs/>
+          <w:sz w:val="22"/>
+          <w:szCs w:val="22"/>
+        </w:rPr>
+        <w:t xml:space="preserve">Branch = develop</w:t>
+      </w:r>
+      <w:r>
+        <w:rPr>
+          <w:rFonts w:ascii="Calibri" w:cs="Calibri" w:eastAsia="Calibri" w:hAnsi="Calibri"/>
+          <w:sz w:val="22"/>
+          <w:szCs w:val="22"/>
+        </w:rPr>
+        <w:t xml:space="preserve">, </w:t>
+      </w:r>
+      <w:r>
+        <w:rPr>
+          <w:rFonts w:ascii="Calibri" w:cs="Calibri" w:eastAsia="Calibri" w:hAnsi="Calibri"/>
+          <w:b/>
+          <w:bCs/>
+          <w:sz w:val="22"/>
+          <w:szCs w:val="22"/>
+        </w:rPr>
+        <w:t xml:space="preserve">Root Directory = backend</w:t>
+      </w:r>
+      <w:r>
+        <w:rPr>
+          <w:rFonts w:ascii="Calibri" w:cs="Calibri" w:eastAsia="Calibri" w:hAnsi="Calibri"/>
+          <w:sz w:val="22"/>
+          <w:szCs w:val="22"/>
+        </w:rPr>
+        <w:t xml:space="preserve">, Build Command </w:t>
       </w:r>
       <w:r>
         <w:rPr>
@@ -14607,7 +14926,7 @@
           <w:sz w:val="22"/>
           <w:szCs w:val="22"/>
         </w:rPr>
-        <w:t xml:space="preserve">, lệnh chạy </w:t>
+        <w:t xml:space="preserve">, Start Command </w:t>
       </w:r>
       <w:r>
         <w:rPr>
@@ -14623,7 +14942,25 @@
           <w:sz w:val="22"/>
           <w:szCs w:val="22"/>
         </w:rPr>
-        <w:t xml:space="preserve">. Thêm biến môi trường ở trang cấu hình của Render, không ghi vào code.</w:t>
+        <w:t xml:space="preserve">, </w:t>
+      </w:r>
+      <w:r>
+        <w:rPr>
+          <w:rFonts w:ascii="Calibri" w:cs="Calibri" w:eastAsia="Calibri" w:hAnsi="Calibri"/>
+          <w:b/>
+          <w:bCs/>
+          <w:sz w:val="22"/>
+          <w:szCs w:val="22"/>
+        </w:rPr>
+        <w:t xml:space="preserve">Health Check Path = /health</w:t>
+      </w:r>
+      <w:r>
+        <w:rPr>
+          <w:rFonts w:ascii="Calibri" w:cs="Calibri" w:eastAsia="Calibri" w:hAnsi="Calibri"/>
+          <w:sz w:val="22"/>
+          <w:szCs w:val="22"/>
+        </w:rPr>
+        <w:t xml:space="preserve">, gói Free. Thêm biến môi trường ở trang cấu hình của Render (không ghi vào code). Render tự triển khai lại mỗi khi gộp code vào develop.</w:t>
       </w:r>
     </w:p>
     <w:p>
@@ -18559,7 +18896,7 @@
                 <w:sz w:val="18"/>
                 <w:szCs w:val="18"/>
               </w:rPr>
-              <w:t xml:space="preserve">Dùng .gitignore; nếu lộ, đổi khóa ngay</w:t>
+              <w:t xml:space="preserve">Dùng .gitignore; che khóa khi chụp màn hình; nếu lộ, đổi khóa ngay và cập nhật .env cùng Render</w:t>
             </w:r>
           </w:p>
         </w:tc>
@@ -18590,6 +18927,131 @@
                 <w:szCs w:val="18"/>
               </w:rPr>
               <w:t xml:space="preserve">Cao</w:t>
+            </w:r>
+          </w:p>
+        </w:tc>
+        <w:tc>
+          <w:tcPr>
+            <w:tcW w:type="dxa" w:w="1600"/>
+            <w:tcBorders>
+              <w:top w:val="single" w:color="BFBFBF" w:sz="4"/>
+              <w:left w:val="single" w:color="BFBFBF" w:sz="4"/>
+              <w:bottom w:val="single" w:color="BFBFBF" w:sz="4"/>
+              <w:right w:val="single" w:color="BFBFBF" w:sz="4"/>
+            </w:tcBorders>
+            <w:tcMar>
+              <w:top w:type="dxa" w:w="70"/>
+              <w:left w:type="dxa" w:w="100"/>
+              <w:bottom w:type="dxa" w:w="70"/>
+              <w:right w:type="dxa" w:w="100"/>
+            </w:tcMar>
+          </w:tcPr>
+          <w:p>
+            <w:pPr>
+              <w:spacing w:after="50" w:line="252"/>
+            </w:pPr>
+            <w:r>
+              <w:rPr>
+                <w:rFonts w:ascii="Calibri" w:cs="Calibri" w:eastAsia="Calibri" w:hAnsi="Calibri"/>
+                <w:sz w:val="18"/>
+                <w:szCs w:val="18"/>
+              </w:rPr>
+              <w:t xml:space="preserve">A</w:t>
+            </w:r>
+          </w:p>
+        </w:tc>
+      </w:tr>
+      <w:tr>
+        <w:trPr>
+          <w:cantSplit/>
+        </w:trPr>
+        <w:tc>
+          <w:tcPr>
+            <w:tcW w:type="dxa" w:w="2800"/>
+            <w:tcBorders>
+              <w:top w:val="single" w:color="BFBFBF" w:sz="4"/>
+              <w:left w:val="single" w:color="BFBFBF" w:sz="4"/>
+              <w:bottom w:val="single" w:color="BFBFBF" w:sz="4"/>
+              <w:right w:val="single" w:color="BFBFBF" w:sz="4"/>
+            </w:tcBorders>
+            <w:tcMar>
+              <w:top w:type="dxa" w:w="70"/>
+              <w:left w:type="dxa" w:w="100"/>
+              <w:bottom w:type="dxa" w:w="70"/>
+              <w:right w:type="dxa" w:w="100"/>
+            </w:tcMar>
+          </w:tcPr>
+          <w:p>
+            <w:pPr>
+              <w:spacing w:after="50" w:line="252"/>
+            </w:pPr>
+            <w:r>
+              <w:rPr>
+                <w:rFonts w:ascii="Calibri" w:cs="Calibri" w:eastAsia="Calibri" w:hAnsi="Calibri"/>
+                <w:sz w:val="18"/>
+                <w:szCs w:val="18"/>
+              </w:rPr>
+              <w:t xml:space="preserve">Token vẫn dùng được tối đa 1 giờ sau khi người dùng bị xóa hoặc bị khóa</w:t>
+            </w:r>
+          </w:p>
+        </w:tc>
+        <w:tc>
+          <w:tcPr>
+            <w:tcW w:type="dxa" w:w="4038"/>
+            <w:tcBorders>
+              <w:top w:val="single" w:color="BFBFBF" w:sz="4"/>
+              <w:left w:val="single" w:color="BFBFBF" w:sz="4"/>
+              <w:bottom w:val="single" w:color="BFBFBF" w:sz="4"/>
+              <w:right w:val="single" w:color="BFBFBF" w:sz="4"/>
+            </w:tcBorders>
+            <w:tcMar>
+              <w:top w:type="dxa" w:w="70"/>
+              <w:left w:type="dxa" w:w="100"/>
+              <w:bottom w:type="dxa" w:w="70"/>
+              <w:right w:type="dxa" w:w="100"/>
+            </w:tcMar>
+          </w:tcPr>
+          <w:p>
+            <w:pPr>
+              <w:spacing w:after="50" w:line="252"/>
+            </w:pPr>
+            <w:r>
+              <w:rPr>
+                <w:rFonts w:ascii="Calibri" w:cs="Calibri" w:eastAsia="Calibri" w:hAnsi="Calibri"/>
+                <w:sz w:val="18"/>
+                <w:szCs w:val="18"/>
+              </w:rPr>
+              <w:t xml:space="preserve">Endpoint cần quyền tra thêm bảng profiles mỗi request; khóa tài khoản làm cả hai lớp (profiles và Supabase Auth)</w:t>
+            </w:r>
+          </w:p>
+        </w:tc>
+        <w:tc>
+          <w:tcPr>
+            <w:tcW w:type="dxa" w:w="1200"/>
+            <w:tcBorders>
+              <w:top w:val="single" w:color="BFBFBF" w:sz="4"/>
+              <w:left w:val="single" w:color="BFBFBF" w:sz="4"/>
+              <w:bottom w:val="single" w:color="BFBFBF" w:sz="4"/>
+              <w:right w:val="single" w:color="BFBFBF" w:sz="4"/>
+            </w:tcBorders>
+            <w:tcMar>
+              <w:top w:type="dxa" w:w="70"/>
+              <w:left w:type="dxa" w:w="100"/>
+              <w:bottom w:type="dxa" w:w="70"/>
+              <w:right w:type="dxa" w:w="100"/>
+            </w:tcMar>
+          </w:tcPr>
+          <w:p>
+            <w:pPr>
+              <w:spacing w:after="50" w:line="252"/>
+            </w:pPr>
+            <w:r>
+              <w:rPr>
+                <w:rFonts w:ascii="Calibri" w:cs="Calibri" w:eastAsia="Calibri" w:hAnsi="Calibri"/>
+                <w:sz w:val="18"/>
+                <w:szCs w:val="18"/>
+              </w:rPr>
+              <w:t xml:space="preserve">Trung bình</w:t>
             </w:r>
           </w:p>
         </w:tc>

</xml_diff>